<commit_message>
Expand 'why AAPS Average remains the conservative default' in conclusion
Three concrete numerical departures explain why substituting smoothers in
oref0 is a behaviour change of unknown sign without retuning:
- peak rate magnitude differs by 17 pp across smoothers
- timing differs by 5 min on real meal events
- outlier-spike absorption differs dramatically (26% to 93%)
</commit_message>
<xml_diff>
--- a/reports/SID_UKF_for_Diabettech_readers.docx
+++ b/reports/SID_UKF_for_Diabettech_readers.docx
@@ -4053,7 +4053,71 @@
     </w:p>
     <w:p>
       <w:r>
-        <w:t>For classical oref0 use, the case for migrating to the UKF or Trio SG is strongest for users dealing with sensor noise or compression — both eliminate over 93% of SID-flagged structural noise clusters versus the AAPS smoothers' approximately 70%. The case for the UKF specifically is that its bimodal outlier-rejection mechanism is the most principled response to compression-style sensor errors: routine readings sail through unchanged, while the rare physically-implausible spikes are decisively absorbed. For users without significant sensor noise, the AAPS Average default remains reasonable because the existing oref0 thresholds were tuned for it.</w:t>
+        <w:t xml:space="preserve">For classical oref0 use, the case for migrating to the UKF or Trio SG is strongest for users dealing with sensor noise or compression — both eliminate over 93% of SID-flagged structural noise clusters versus the AAPS smoothers' approximately 70%. The case for the UKF specifically is that its bimodal outlier-rejection mechanism is the most principled response to compression-style sensor errors: routine readings sail through unchanged, while the rare physically-implausible spikes are decisively absorbed. For users without significant sensor noise, </w:t>
+      </w:r>
+      <w:r>
+        <w:rPr>
+          <w:b/>
+        </w:rPr>
+        <w:t>AAPS Average remains the implicit baseline because the existing SMB-on-rise / temp-basal / UAM thresholds in oref0 were empirically tuned against the rate signal it produces</w:t>
+      </w:r>
+      <w:r>
+        <w:t xml:space="preserve"> — and this study identifies three specific ways the other smoothers depart from that baseline.</w:t>
+      </w:r>
+    </w:p>
+    <w:p>
+      <w:r>
+        <w:t xml:space="preserve">First, </w:t>
+      </w:r>
+      <w:r>
+        <w:rPr>
+          <w:b/>
+        </w:rPr>
+        <w:t>peak rate magnitude differs by 17 percentage points across the four smoothers</w:t>
+      </w:r>
+      <w:r>
+        <w:t xml:space="preserve"> (AAPS Average 87%, AAPS Exponential 91%, Trio Savitzky-Golay 77%, Adaptive UKF 75% peak-rate retention vs raw on real meal events). Same SMB-on-rise threshold of 1 mg/dL/min therefore fires more easily on AAPS Exp (taller rate signal) and less easily on the UKF and Trio SG (shorter rate signal). Second, </w:t>
+      </w:r>
+      <w:r>
+        <w:rPr>
+          <w:b/>
+        </w:rPr>
+        <w:t>timing differs by 5 minutes</w:t>
+      </w:r>
+      <w:r>
+        <w:t xml:space="preserve">: AAPS Exp's median time to cross the SMB-on-rise rate threshold is 25 minutes after a meal note vs 20 minutes for the other three, so an SMB that fires at the "right" moment on AAPS Average will fire 5 minutes late on AAPS Exp. Third, </w:t>
+      </w:r>
+      <w:r>
+        <w:rPr>
+          <w:b/>
+        </w:rPr>
+        <w:t>outlier behaviour differs dramatically</w:t>
+      </w:r>
+      <w:r>
+        <w:t>: AAPS Average absorbs 26% of single-step ≥ 40 mg/dL spikes, the UKF 46%, Trio Savitzky-Golay 93%. On noisy sensor sessions, the UKF and especially Trio SG will hide spike events that AAPS Average would have shown — and the loop's reaction (or non-reaction) to those spikes was tuned with AAPS Average's intermediate behaviour in mind.</w:t>
+      </w:r>
+    </w:p>
+    <w:p>
+      <w:r>
+        <w:t xml:space="preserve">Each of those three shifts may turn out to be net beneficial — but each is a behaviour change relative to a system whose thresholds were tuned for a different smoother, and </w:t>
+      </w:r>
+      <w:r>
+        <w:rPr>
+          <w:i/>
+        </w:rPr>
+        <w:t>whether</w:t>
+      </w:r>
+      <w:r>
+        <w:t xml:space="preserve"> the net effect is beneficial requires running the full closed-loop oref0 decision engine end-to-end with each smoother in front of it (the natural follow-up study). Until that is done, </w:t>
+      </w:r>
+      <w:r>
+        <w:rPr>
+          <w:b/>
+        </w:rPr>
+        <w:t>"AAPS Average + existing oref0 thresholds" is the conservative default; anything else with the same thresholds is a behaviour change of unknown sign</w:t>
+      </w:r>
+      <w:r>
+        <w:t>.</w:t>
       </w:r>
     </w:p>
     <w:p>

</xml_diff>

<commit_message>
Reframe 'conservative default' around the historical G4 → G6+AAPS Avg lineage
The original framing implied AAPS Average was a principled baseline that
oref0 thresholds were tuned against. The accurate history is that oref0
was built for Dexcom G4, and AAPS Average was added later to mimic G6
on-sensor smoothing so that G6+AAPS-Avg produced roughly the same total
smoothing budget as G4-raw. The conservative default is therefore the
total smoothing envelope, not any specific smoother — and switching
either the sensor (G6 → G7) or the software smoother shifts that
envelope. None of the resulting combinations have been empirically
validated against the original threshold calibration.
</commit_message>
<xml_diff>
--- a/reports/SID_UKF_for_Diabettech_readers.docx
+++ b/reports/SID_UKF_for_Diabettech_readers.docx
@@ -4053,30 +4053,41 @@
     </w:p>
     <w:p>
       <w:r>
-        <w:t xml:space="preserve">For classical oref0 use, the case for migrating to the UKF or Trio SG is strongest for users dealing with sensor noise or compression — both eliminate over 93% of SID-flagged structural noise clusters versus the AAPS smoothers' approximately 70%. The case for the UKF specifically is that its bimodal outlier-rejection mechanism is the most principled response to compression-style sensor errors: routine readings sail through unchanged, while the rare physically-implausible spikes are decisively absorbed. For users without significant sensor noise, </w:t>
-      </w:r>
+        <w:t>For classical oref0 use, the case for migrating to the UKF or Trio SG is strongest for users dealing with sensor noise or compression — both eliminate over 93% of SID-flagged structural noise clusters versus the AAPS smoothers' approximately 70%. The case for the UKF specifically is that its bimodal outlier-rejection mechanism is the most principled response to compression-style sensor errors: routine readings sail through unchanged, while the rare physically-implausible spikes are decisively absorbed. The case against migrating, for users without significant sensor noise, requires acknowledging some history.</w:t>
+      </w:r>
+    </w:p>
+    <w:p>
       <w:r>
         <w:rPr>
           <w:b/>
         </w:rPr>
-        <w:t>AAPS Average remains the implicit baseline because the existing SMB-on-rise / temp-basal / UAM thresholds in oref0 were empirically tuned against the rate signal it produces</w:t>
-      </w:r>
-      <w:r>
-        <w:t xml:space="preserve"> — and this study identifies three specific ways the other smoothers depart from that baseline.</w:t>
+        <w:t>oref0 was first built for Dexcom G4 in the early days of DIY closed-loop AID</w:t>
+      </w:r>
+      <w:r>
+        <w:t>, and the SMB-on-rise, temp-basal, and UAM thresholds got their initial calibration against G4-era CGM data. AAPS Average came later — its 3-point central averaging was specifically designed to approximate the on-sensor smoothing that the Dexcom G6 transmitter applies internally, so that users running G6 plus AAPS Average would land in roughly the same total-smoothing regime that the G4 era had already produced. The combination "G6 + AAPS Average" therefore approximates the original threshold-calibration assumption by historical accident more than by design: G6's on-board filter plus AAPS Average's 3-point average roughly equals G4's raw stream, which is what the thresholds were tuned against.</w:t>
       </w:r>
     </w:p>
     <w:p>
       <w:r>
-        <w:t xml:space="preserve">First, </w:t>
+        <w:t xml:space="preserve">That history matters because it changes what "the conservative default" is. The thing that needs to be preserved for oref0's existing thresholds to behave as intended is </w:t>
       </w:r>
       <w:r>
         <w:rPr>
           <w:b/>
         </w:rPr>
-        <w:t>peak rate magnitude differs by 17 percentage points across the four smoothers</w:t>
-      </w:r>
-      <w:r>
-        <w:t xml:space="preserve"> (AAPS Average 87%, AAPS Exponential 91%, Trio Savitzky-Golay 77%, Adaptive UKF 75% peak-rate retention vs raw on real meal events). Same SMB-on-rise threshold of 1 mg/dL/min therefore fires more easily on AAPS Exp (taller rate signal) and less easily on the UKF and Trio SG (shorter rate signal). Second, </w:t>
+        <w:t>the total smoothing budget across the sensor + software-smoother chain</w:t>
+      </w:r>
+      <w:r>
+        <w:t xml:space="preserve">, not any particular smoother. The data identifies three specific ways that budget changes when components are substituted. First, </w:t>
+      </w:r>
+      <w:r>
+        <w:rPr>
+          <w:b/>
+        </w:rPr>
+        <w:t>peak rate magnitude differs by 17 percentage points across the four software smoothers</w:t>
+      </w:r>
+      <w:r>
+        <w:t xml:space="preserve"> (AAPS Average 87%, AAPS Exponential 91%, Trio Savitzky-Golay 77%, Adaptive UKF 75% peak-rate retention vs raw on real meal events). Same SMB-on-rise threshold therefore fires more easily on AAPS Exp and less easily on UKF or Trio SG. Second, </w:t>
       </w:r>
       <w:r>
         <w:rPr>
@@ -4085,7 +4096,7 @@
         <w:t>timing differs by 5 minutes</w:t>
       </w:r>
       <w:r>
-        <w:t xml:space="preserve">: AAPS Exp's median time to cross the SMB-on-rise rate threshold is 25 minutes after a meal note vs 20 minutes for the other three, so an SMB that fires at the "right" moment on AAPS Average will fire 5 minutes late on AAPS Exp. Third, </w:t>
+        <w:t xml:space="preserve">: AAPS Exp's median time to cross the SMB-on-rise rate threshold is 25 minutes after a meal note vs 20 minutes for the other three. Third, </w:t>
       </w:r>
       <w:r>
         <w:rPr>
@@ -4094,30 +4105,44 @@
         <w:t>outlier behaviour differs dramatically</w:t>
       </w:r>
       <w:r>
-        <w:t>: AAPS Average absorbs 26% of single-step ≥ 40 mg/dL spikes, the UKF 46%, Trio Savitzky-Golay 93%. On noisy sensor sessions, the UKF and especially Trio SG will hide spike events that AAPS Average would have shown — and the loop's reaction (or non-reaction) to those spikes was tuned with AAPS Average's intermediate behaviour in mind.</w:t>
+        <w:t>: AAPS Average absorbs 26% of single-step ≥ 40 mg/dL spikes, the UKF 46%, Trio Savitzky-Golay 93%. The UKF and Trio SG hide spike events that AAPS Average would have shown.</w:t>
       </w:r>
     </w:p>
     <w:p>
       <w:r>
-        <w:t xml:space="preserve">Each of those three shifts may turn out to be net beneficial — but each is a behaviour change relative to a system whose thresholds were tuned for a different smoother, and </w:t>
-      </w:r>
-      <w:r>
-        <w:rPr>
-          <w:i/>
-        </w:rPr>
-        <w:t>whether</w:t>
-      </w:r>
-      <w:r>
-        <w:t xml:space="preserve"> the net effect is beneficial requires running the full closed-loop oref0 decision engine end-to-end with each smoother in front of it (the natural follow-up study). Until that is done, </w:t>
+        <w:t xml:space="preserve">Switching the </w:t>
       </w:r>
       <w:r>
         <w:rPr>
           <w:b/>
         </w:rPr>
-        <w:t>"AAPS Average + existing oref0 thresholds" is the conservative default; anything else with the same thresholds is a behaviour change of unknown sign</w:t>
-      </w:r>
-      <w:r>
-        <w:t>.</w:t>
+        <w:t>sensor</w:t>
+      </w:r>
+      <w:r>
+        <w:t xml:space="preserve"> does the same kind of thing on a different axis. G7 applies less on-sensor smoothing than G6 (§3 of the per-sensor companion paper), so "G7 + AAPS Average" already produces a sharper signal than "G6 + AAPS Average" — already a behaviour change relative to the historical tuning, before any software-smoother substitution is considered. This is consistent with the per-sensor finding that hypo preservation drops 3–6 percentage points on G7 across all four smoothers.</w:t>
+      </w:r>
+    </w:p>
+    <w:p>
+      <w:r>
+        <w:t xml:space="preserve">The honest framing is therefore that </w:t>
+      </w:r>
+      <w:r>
+        <w:rPr>
+          <w:b/>
+        </w:rPr>
+        <w:t>everything except the historical G4-era / G6 + AAPS Average envelope is empirically unvalidated against the oref0 thresholds</w:t>
+      </w:r>
+      <w:r>
+        <w:t>. Substituting software smoothers, switching from G6 to G7, or both, all shift the total smoothing budget that downstream oref0 thresholds see. Any of those shifts may turn out to be net beneficial, but none have been validated against actual closed-loop dose decisions. The conservative position is not "AAPS Average is the right baseline" — it is "</w:t>
+      </w:r>
+      <w:r>
+        <w:rPr>
+          <w:b/>
+        </w:rPr>
+        <w:t>whatever combination of sensor and software smoother has produced acceptable looping for you in the past is the only combination with empirical evidence behind it for your specific physiology</w:t>
+      </w:r>
+      <w:r>
+        <w:t>, because the original threshold calibration assumed a particular total-smoothing envelope and no other combination has been measured against it." The natural follow-up study — running the full closed-loop oref0 decision engine end-to-end with each (smoother, sensor) combination — is what would replace this path-dependent default with a principled one.</w:t>
       </w:r>
     </w:p>
     <w:p>

</xml_diff>